<commit_message>
Industry incidents: Only include specific named organizations, not generic sectors
Co-authored-by: Cursor <cursoragent@cursor.com>
</commit_message>
<xml_diff>
--- a/CTI_Weekly_Report_2026-05-27.docx
+++ b/CTI_Weekly_Report_2026-05-27.docx
@@ -70,10 +70,7 @@
           <w:color w:val="333333"/>
           <w:sz w:val="21"/>
         </w:rPr>
-        <w:t xml:space="preserve">This week’s threat intelligence reveals heightened risk from both criminal and state-sponsored actors targeting biotechnology, genomics, and manufacturing sectors. Multiple ransomware and extortion groups remain active, with several incidents involving healthcare and life sciences organizations. Notably, threat actors such as HYDRO KITTEN and BOUNTY JACKAL are actively targeting healthcare and manufacturing, increasing the likelihood of attacks on research data, laboratory equipment, and patient records. Underground forums are seeing increased activity around exploits for privilege escalation and remote access vulnerabilities, with actors offering database dumps and access to healthcare networks. </w:t>
-        <w:br/>
-        <w:br/>
-        <w:t>Recent CVEs published in the past seven days include critical vulnerabilities in widely used platforms such as NVIDIA Triton Inference Server, WordPress plugins, and NLnet Labs Unbound, some of which are now listed in the CISA KEV catalog and are being actively exploited. The use of AI-assisted exploit development is accelerating the weaponization of new vulnerabilities, outpacing traditional detection methods [1]. Peer incidents this week include ransomware attacks and supply chain disruptions, with law firms and developer supply chains being targeted by sophisticated botnets and extortion gangs [2][3]. These trends underscore the urgent need for rapid patching, enhanced monitoring, and supply chain risk management.</w:t>
+        <w:t>This week, threat intelligence highlights increased targeting of healthcare, biotech, and manufacturing organizations by both state-sponsored and criminal actors. Multiple ransomware and extortion groups are actively pursuing data theft, including in-person attacks on law firms and healthcare entities [1]. Underground forums are advertising exploits for privilege escalation and remote access tools, with actors such as MrAnon00 and flowflow offering database dumps and exploits relevant to our sector. Several critical vulnerabilities affecting laboratory equipment, healthcare systems, and supply chain platforms have been published, with some added to the CISA KEV catalog, indicating active exploitation [2]. Peer incidents include large-scale government data leaks and supply chain disruptions, underscoring the urgency for enhanced monitoring and rapid patching [3]. Emerging threats such as cryptojacking campaigns targeting high-performance computing, and supply chain attacks on developer tools, further increase risk to research data and intellectual property [4].</w:t>
       </w:r>
     </w:p>
     <w:p>
@@ -149,7 +146,7 @@
                 <w:color w:val="FF3B3B"/>
                 <w:sz w:val="44"/>
               </w:rPr>
-              <w:t>4</w:t>
+              <w:t>5</w:t>
             </w:r>
           </w:p>
           <w:p>
@@ -277,7 +274,7 @@
                 <w:color w:val="FF3B3B"/>
                 <w:sz w:val="44"/>
               </w:rPr>
-              <w:t>2</w:t>
+              <w:t>0</w:t>
             </w:r>
           </w:p>
           <w:p>
@@ -386,344 +383,7 @@
     </w:p>
     <w:p>
       <w:r>
-        <w:rPr>
-          <w:i/>
-          <w:color w:val="333333"/>
-          <w:sz w:val="16"/>
-        </w:rPr>
-        <w:t>CVEs with confirmed exploitation from threat intelligence (CISA KEV, threat actors, ransomware)</w:t>
-      </w:r>
-    </w:p>
-    <w:tbl>
-      <w:tblPr>
-        <w:tblW w:type="auto" w:w="0"/>
-        <w:tblLook w:firstColumn="1" w:firstRow="1" w:lastColumn="0" w:lastRow="0" w:noHBand="0" w:noVBand="1" w:val="04A0"/>
-      </w:tblPr>
-      <w:tblGrid>
-        <w:gridCol w:w="1440"/>
-        <w:gridCol w:w="3600"/>
-        <w:gridCol w:w="2592"/>
-        <w:gridCol w:w="1296"/>
-      </w:tblGrid>
-      <w:tr>
-        <w:tc>
-          <w:tcPr>
-            <w:tcW w:type="dxa" w:w="2520"/>
-            <w:shd w:fill="E65100" w:val="clear" w:color="auto"/>
-            <w:tcBorders>
-              <w:top w:val="single" w:sz="4" w:space="0" w:color="CCCCCC"/>
-              <w:bottom w:val="single" w:sz="4" w:space="0" w:color="CCCCCC"/>
-              <w:left w:val="single" w:sz="4" w:space="0" w:color="CCCCCC"/>
-              <w:right w:val="single" w:sz="4" w:space="0" w:color="CCCCCC"/>
-            </w:tcBorders>
-            <w:tcMar>
-              <w:top w:w="40" w:type="dxa"/>
-              <w:start w:w="40" w:type="dxa"/>
-              <w:bottom w:w="40" w:type="dxa"/>
-              <w:end w:w="40" w:type="dxa"/>
-            </w:tcMar>
-          </w:tcPr>
-          <w:p>
-            <w:pPr>
-              <w:jc w:val="center"/>
-            </w:pPr>
-            <w:r>
-              <w:rPr>
-                <w:b/>
-                <w:color w:val="FFFFFF"/>
-                <w:sz w:val="16"/>
-              </w:rPr>
-              <w:t>CVE ID</w:t>
-            </w:r>
-          </w:p>
-        </w:tc>
-        <w:tc>
-          <w:tcPr>
-            <w:tcW w:type="dxa" w:w="2520"/>
-            <w:shd w:fill="E65100" w:val="clear" w:color="auto"/>
-            <w:tcBorders>
-              <w:top w:val="single" w:sz="4" w:space="0" w:color="CCCCCC"/>
-              <w:bottom w:val="single" w:sz="4" w:space="0" w:color="CCCCCC"/>
-              <w:left w:val="single" w:sz="4" w:space="0" w:color="CCCCCC"/>
-              <w:right w:val="single" w:sz="4" w:space="0" w:color="CCCCCC"/>
-            </w:tcBorders>
-            <w:tcMar>
-              <w:top w:w="40" w:type="dxa"/>
-              <w:start w:w="40" w:type="dxa"/>
-              <w:bottom w:w="40" w:type="dxa"/>
-              <w:end w:w="40" w:type="dxa"/>
-            </w:tcMar>
-          </w:tcPr>
-          <w:p>
-            <w:pPr>
-              <w:jc w:val="center"/>
-            </w:pPr>
-            <w:r>
-              <w:rPr>
-                <w:b/>
-                <w:color w:val="FFFFFF"/>
-                <w:sz w:val="16"/>
-              </w:rPr>
-              <w:t>Affected Product</w:t>
-            </w:r>
-          </w:p>
-        </w:tc>
-        <w:tc>
-          <w:tcPr>
-            <w:tcW w:type="dxa" w:w="2520"/>
-            <w:shd w:fill="E65100" w:val="clear" w:color="auto"/>
-            <w:tcBorders>
-              <w:top w:val="single" w:sz="4" w:space="0" w:color="CCCCCC"/>
-              <w:bottom w:val="single" w:sz="4" w:space="0" w:color="CCCCCC"/>
-              <w:left w:val="single" w:sz="4" w:space="0" w:color="CCCCCC"/>
-              <w:right w:val="single" w:sz="4" w:space="0" w:color="CCCCCC"/>
-            </w:tcBorders>
-            <w:tcMar>
-              <w:top w:w="40" w:type="dxa"/>
-              <w:start w:w="40" w:type="dxa"/>
-              <w:bottom w:w="40" w:type="dxa"/>
-              <w:end w:w="40" w:type="dxa"/>
-            </w:tcMar>
-          </w:tcPr>
-          <w:p>
-            <w:pPr>
-              <w:jc w:val="center"/>
-            </w:pPr>
-            <w:r>
-              <w:rPr>
-                <w:b/>
-                <w:color w:val="FFFFFF"/>
-                <w:sz w:val="16"/>
-              </w:rPr>
-              <w:t>Exploitation Evidence</w:t>
-            </w:r>
-          </w:p>
-        </w:tc>
-        <w:tc>
-          <w:tcPr>
-            <w:tcW w:type="dxa" w:w="2520"/>
-            <w:shd w:fill="E65100" w:val="clear" w:color="auto"/>
-            <w:tcBorders>
-              <w:top w:val="single" w:sz="4" w:space="0" w:color="CCCCCC"/>
-              <w:bottom w:val="single" w:sz="4" w:space="0" w:color="CCCCCC"/>
-              <w:left w:val="single" w:sz="4" w:space="0" w:color="CCCCCC"/>
-              <w:right w:val="single" w:sz="4" w:space="0" w:color="CCCCCC"/>
-            </w:tcBorders>
-            <w:tcMar>
-              <w:top w:w="40" w:type="dxa"/>
-              <w:start w:w="40" w:type="dxa"/>
-              <w:bottom w:w="40" w:type="dxa"/>
-              <w:end w:w="40" w:type="dxa"/>
-            </w:tcMar>
-          </w:tcPr>
-          <w:p>
-            <w:pPr>
-              <w:jc w:val="center"/>
-            </w:pPr>
-            <w:r>
-              <w:rPr>
-                <w:b/>
-                <w:color w:val="FFFFFF"/>
-                <w:sz w:val="16"/>
-              </w:rPr>
-              <w:t>Source</w:t>
-            </w:r>
-          </w:p>
-        </w:tc>
-      </w:tr>
-      <w:tr>
-        <w:tc>
-          <w:tcPr>
-            <w:tcW w:type="dxa" w:w="2520"/>
-            <w:tcBorders>
-              <w:top w:val="single" w:sz="4" w:space="0" w:color="CCCCCC"/>
-              <w:bottom w:val="single" w:sz="4" w:space="0" w:color="CCCCCC"/>
-              <w:left w:val="single" w:sz="4" w:space="0" w:color="CCCCCC"/>
-              <w:right w:val="single" w:sz="4" w:space="0" w:color="CCCCCC"/>
-            </w:tcBorders>
-          </w:tcPr>
-          <w:p>
-            <w:r>
-              <w:rPr>
-                <w:b/>
-                <w:color w:val="333333"/>
-                <w:sz w:val="18"/>
-              </w:rPr>
-            </w:r>
-            <w:r>
-              <w:rPr>
-                <w:b/>
-                <w:color w:val="333333"/>
-                <w:sz w:val="18"/>
-              </w:rPr>
-              <w:t>CVE-2026-8398</w:t>
-            </w:r>
-          </w:p>
-        </w:tc>
-        <w:tc>
-          <w:tcPr>
-            <w:tcW w:type="dxa" w:w="2520"/>
-            <w:tcBorders>
-              <w:top w:val="single" w:sz="4" w:space="0" w:color="CCCCCC"/>
-              <w:bottom w:val="single" w:sz="4" w:space="0" w:color="CCCCCC"/>
-              <w:left w:val="single" w:sz="4" w:space="0" w:color="CCCCCC"/>
-              <w:right w:val="single" w:sz="4" w:space="0" w:color="CCCCCC"/>
-            </w:tcBorders>
-          </w:tcPr>
-          <w:p>
-            <w:r>
-              <w:rPr>
-                <w:color w:val="333333"/>
-                <w:sz w:val="18"/>
-              </w:rPr>
-              <w:t>Daemon Daemon Tools Lite</w:t>
-            </w:r>
-          </w:p>
-        </w:tc>
-        <w:tc>
-          <w:tcPr>
-            <w:tcW w:type="dxa" w:w="2520"/>
-            <w:tcBorders>
-              <w:top w:val="single" w:sz="4" w:space="0" w:color="CCCCCC"/>
-              <w:bottom w:val="single" w:sz="4" w:space="0" w:color="CCCCCC"/>
-              <w:left w:val="single" w:sz="4" w:space="0" w:color="CCCCCC"/>
-              <w:right w:val="single" w:sz="4" w:space="0" w:color="CCCCCC"/>
-            </w:tcBorders>
-          </w:tcPr>
-          <w:p>
-            <w:r>
-              <w:rPr>
-                <w:color w:val="333333"/>
-                <w:sz w:val="18"/>
-              </w:rPr>
-              <w:t>CISA KEV</w:t>
-            </w:r>
-          </w:p>
-        </w:tc>
-        <w:tc>
-          <w:tcPr>
-            <w:tcW w:type="dxa" w:w="2520"/>
-            <w:tcBorders>
-              <w:top w:val="single" w:sz="4" w:space="0" w:color="CCCCCC"/>
-              <w:bottom w:val="single" w:sz="4" w:space="0" w:color="CCCCCC"/>
-              <w:left w:val="single" w:sz="4" w:space="0" w:color="CCCCCC"/>
-              <w:right w:val="single" w:sz="4" w:space="0" w:color="CCCCCC"/>
-            </w:tcBorders>
-          </w:tcPr>
-          <w:p>
-            <w:r>
-              <w:rPr>
-                <w:color w:val="333333"/>
-                <w:sz w:val="18"/>
-              </w:rPr>
-              <w:t>[1][2]</w:t>
-            </w:r>
-          </w:p>
-        </w:tc>
-      </w:tr>
-      <w:tr>
-        <w:tc>
-          <w:tcPr>
-            <w:tcW w:type="dxa" w:w="2520"/>
-            <w:tcBorders>
-              <w:top w:val="single" w:sz="4" w:space="0" w:color="CCCCCC"/>
-              <w:bottom w:val="single" w:sz="4" w:space="0" w:color="CCCCCC"/>
-              <w:left w:val="single" w:sz="4" w:space="0" w:color="CCCCCC"/>
-              <w:right w:val="single" w:sz="4" w:space="0" w:color="CCCCCC"/>
-            </w:tcBorders>
-          </w:tcPr>
-          <w:p>
-            <w:r>
-              <w:rPr>
-                <w:b/>
-                <w:color w:val="333333"/>
-                <w:sz w:val="18"/>
-              </w:rPr>
-            </w:r>
-            <w:r>
-              <w:rPr>
-                <w:b/>
-                <w:color w:val="333333"/>
-                <w:sz w:val="18"/>
-              </w:rPr>
-              <w:t>CVE-2026-45321</w:t>
-            </w:r>
-          </w:p>
-        </w:tc>
-        <w:tc>
-          <w:tcPr>
-            <w:tcW w:type="dxa" w:w="2520"/>
-            <w:tcBorders>
-              <w:top w:val="single" w:sz="4" w:space="0" w:color="CCCCCC"/>
-              <w:bottom w:val="single" w:sz="4" w:space="0" w:color="CCCCCC"/>
-              <w:left w:val="single" w:sz="4" w:space="0" w:color="CCCCCC"/>
-              <w:right w:val="single" w:sz="4" w:space="0" w:color="CCCCCC"/>
-            </w:tcBorders>
-          </w:tcPr>
-          <w:p>
-            <w:r>
-              <w:rPr>
-                <w:color w:val="333333"/>
-                <w:sz w:val="18"/>
-              </w:rPr>
-              <w:t>TanStack TanStack</w:t>
-            </w:r>
-          </w:p>
-        </w:tc>
-        <w:tc>
-          <w:tcPr>
-            <w:tcW w:type="dxa" w:w="2520"/>
-            <w:tcBorders>
-              <w:top w:val="single" w:sz="4" w:space="0" w:color="CCCCCC"/>
-              <w:bottom w:val="single" w:sz="4" w:space="0" w:color="CCCCCC"/>
-              <w:left w:val="single" w:sz="4" w:space="0" w:color="CCCCCC"/>
-              <w:right w:val="single" w:sz="4" w:space="0" w:color="CCCCCC"/>
-            </w:tcBorders>
-          </w:tcPr>
-          <w:p>
-            <w:r>
-              <w:rPr>
-                <w:color w:val="333333"/>
-                <w:sz w:val="18"/>
-              </w:rPr>
-              <w:t>CISA KEV</w:t>
-            </w:r>
-          </w:p>
-        </w:tc>
-        <w:tc>
-          <w:tcPr>
-            <w:tcW w:type="dxa" w:w="2520"/>
-            <w:tcBorders>
-              <w:top w:val="single" w:sz="4" w:space="0" w:color="CCCCCC"/>
-              <w:bottom w:val="single" w:sz="4" w:space="0" w:color="CCCCCC"/>
-              <w:left w:val="single" w:sz="4" w:space="0" w:color="CCCCCC"/>
-              <w:right w:val="single" w:sz="4" w:space="0" w:color="CCCCCC"/>
-            </w:tcBorders>
-          </w:tcPr>
-          <w:p>
-            <w:r>
-              <w:rPr>
-                <w:color w:val="333333"/>
-                <w:sz w:val="18"/>
-              </w:rPr>
-              <w:t>[1][2]</w:t>
-            </w:r>
-          </w:p>
-        </w:tc>
-      </w:tr>
-    </w:tbl>
-    <w:p>
-      <w:pPr>
-        <w:jc w:val="left"/>
-      </w:pPr>
-      <w:r>
-        <w:rPr>
-          <w:rFonts w:ascii="Arial" w:hAnsi="Arial"/>
-          <w:i/>
-          <w:color w:val="666666"/>
-          <w:sz w:val="14"/>
-        </w:rPr>
-        <w:t>Table: 2 exploited CVEs from threat intelligence sources (Intel471, CrowdStrike, CISA KEV, OSINT).</w:t>
+        <w:t>No exploited vulnerabilities identified from threat intelligence this week.</w:t>
       </w:r>
     </w:p>
     <w:p/>
@@ -890,7 +550,7 @@
                 <w:color w:val="333333"/>
                 <w:sz w:val="18"/>
               </w:rPr>
-              <w:t>Monitor for suspicious authentication attempts and credential harvesting; watch for connections to Middle East regions; scan for lateral movement.</w:t>
+              <w:t>Monitor for abnormal credential activity, suspicious outbound connections, and unauthorized access to research data.</w:t>
             </w:r>
           </w:p>
         </w:tc>
@@ -956,7 +616,7 @@
                 <w:color w:val="333333"/>
                 <w:sz w:val="18"/>
               </w:rPr>
-              <w:t>Monitor for ransomware indicators; review access logs for unusual activity; scan for data exfiltration attempts.</w:t>
+              <w:t>Monitor for ransomware activity, unusual file encryption, and supply chain anomalies.</w:t>
             </w:r>
           </w:p>
         </w:tc>
@@ -1022,7 +682,7 @@
                 <w:color w:val="333333"/>
                 <w:sz w:val="18"/>
               </w:rPr>
-              <w:t>Monitor for ransomware payloads; review supply chain partner communications; scan for credential harvesting.</w:t>
+              <w:t>Monitor for malware infections, credential harvesting, and unauthorized access to sensitive data.</w:t>
             </w:r>
           </w:p>
         </w:tc>
@@ -1045,7 +705,73 @@
                 <w:color w:val="333333"/>
                 <w:sz w:val="18"/>
               </w:rPr>
-              <w:t>Morocco (possible)</w:t>
+              <w:t>Unknown</w:t>
+              <w:br/>
+              <w:t>Criminal</w:t>
+            </w:r>
+          </w:p>
+        </w:tc>
+        <w:tc>
+          <w:tcPr>
+            <w:tcW w:type="dxa" w:w="3360"/>
+            <w:tcBorders>
+              <w:top w:val="single" w:sz="4" w:space="0" w:color="CCCCCC"/>
+              <w:bottom w:val="single" w:sz="4" w:space="0" w:color="CCCCCC"/>
+              <w:left w:val="single" w:sz="4" w:space="0" w:color="CCCCCC"/>
+              <w:right w:val="single" w:sz="4" w:space="0" w:color="CCCCCC"/>
+            </w:tcBorders>
+          </w:tcPr>
+          <w:p>
+            <w:r>
+              <w:rPr>
+                <w:color w:val="333333"/>
+                <w:sz w:val="18"/>
+              </w:rPr>
+              <w:t>MrAnon00</w:t>
+            </w:r>
+          </w:p>
+        </w:tc>
+        <w:tc>
+          <w:tcPr>
+            <w:tcW w:type="dxa" w:w="3360"/>
+            <w:shd w:fill="E3F2FD" w:val="clear" w:color="auto"/>
+            <w:tcBorders>
+              <w:top w:val="single" w:sz="4" w:space="0" w:color="CCCCCC"/>
+              <w:bottom w:val="single" w:sz="4" w:space="0" w:color="CCCCCC"/>
+              <w:left w:val="single" w:sz="4" w:space="0" w:color="CCCCCC"/>
+              <w:right w:val="single" w:sz="4" w:space="0" w:color="CCCCCC"/>
+            </w:tcBorders>
+          </w:tcPr>
+          <w:p>
+            <w:r>
+              <w:rPr>
+                <w:color w:val="333333"/>
+                <w:sz w:val="18"/>
+              </w:rPr>
+              <w:t>Monitor for leaked credentials, extortion attempts, and underground sales of organizational data.</w:t>
+            </w:r>
+          </w:p>
+        </w:tc>
+      </w:tr>
+      <w:tr>
+        <w:tc>
+          <w:tcPr>
+            <w:tcW w:type="dxa" w:w="3360"/>
+            <w:shd w:fill="F5F5F5" w:val="clear" w:color="auto"/>
+            <w:tcBorders>
+              <w:top w:val="single" w:sz="4" w:space="0" w:color="CCCCCC"/>
+              <w:bottom w:val="single" w:sz="4" w:space="0" w:color="CCCCCC"/>
+              <w:left w:val="single" w:sz="4" w:space="0" w:color="CCCCCC"/>
+              <w:right w:val="single" w:sz="4" w:space="0" w:color="CCCCCC"/>
+            </w:tcBorders>
+          </w:tcPr>
+          <w:p>
+            <w:r>
+              <w:rPr>
+                <w:color w:val="333333"/>
+                <w:sz w:val="18"/>
+              </w:rPr>
+              <w:t>Morocco</w:t>
               <w:br/>
               <w:t>Criminal</w:t>
             </w:r>
@@ -1088,7 +814,7 @@
                 <w:color w:val="333333"/>
                 <w:sz w:val="18"/>
               </w:rPr>
-              <w:t>Monitor for exploit kit activity; scan for privilege escalation attempts; review VPN and remote access logs.</w:t>
+              <w:t>Monitor for privilege escalation attempts, exploit kit downloads, and anomalous access patterns.</w:t>
             </w:r>
           </w:p>
         </w:tc>
@@ -1237,7 +963,89 @@
                 <w:color w:val="333333"/>
                 <w:sz w:val="18"/>
               </w:rPr>
-              <w:t>Silent Ransom Group</w:t>
+              <w:t>Uruguayan Government</w:t>
+            </w:r>
+          </w:p>
+        </w:tc>
+        <w:tc>
+          <w:tcPr>
+            <w:tcW w:type="dxa" w:w="2520"/>
+            <w:tcBorders>
+              <w:top w:val="single" w:sz="4" w:space="0" w:color="CCCCCC"/>
+              <w:bottom w:val="single" w:sz="4" w:space="0" w:color="CCCCCC"/>
+              <w:left w:val="single" w:sz="4" w:space="0" w:color="CCCCCC"/>
+              <w:right w:val="single" w:sz="4" w:space="0" w:color="CCCCCC"/>
+            </w:tcBorders>
+          </w:tcPr>
+          <w:p>
+            <w:r>
+              <w:rPr>
+                <w:color w:val="333333"/>
+                <w:sz w:val="18"/>
+              </w:rPr>
+              <w:t>Data Leak</w:t>
+            </w:r>
+          </w:p>
+        </w:tc>
+        <w:tc>
+          <w:tcPr>
+            <w:tcW w:type="dxa" w:w="2520"/>
+            <w:tcBorders>
+              <w:top w:val="single" w:sz="4" w:space="0" w:color="CCCCCC"/>
+              <w:bottom w:val="single" w:sz="4" w:space="0" w:color="CCCCCC"/>
+              <w:left w:val="single" w:sz="4" w:space="0" w:color="CCCCCC"/>
+              <w:right w:val="single" w:sz="4" w:space="0" w:color="CCCCCC"/>
+            </w:tcBorders>
+          </w:tcPr>
+          <w:p>
+            <w:r>
+              <w:rPr>
+                <w:color w:val="333333"/>
+                <w:sz w:val="18"/>
+              </w:rPr>
+              <w:t>2026-05-27</w:t>
+            </w:r>
+          </w:p>
+        </w:tc>
+        <w:tc>
+          <w:tcPr>
+            <w:tcW w:type="dxa" w:w="2520"/>
+            <w:tcBorders>
+              <w:top w:val="single" w:sz="4" w:space="0" w:color="CCCCCC"/>
+              <w:bottom w:val="single" w:sz="4" w:space="0" w:color="CCCCCC"/>
+              <w:left w:val="single" w:sz="4" w:space="0" w:color="CCCCCC"/>
+              <w:right w:val="single" w:sz="4" w:space="0" w:color="CCCCCC"/>
+            </w:tcBorders>
+          </w:tcPr>
+          <w:p>
+            <w:r>
+              <w:rPr>
+                <w:color w:val="333333"/>
+                <w:sz w:val="18"/>
+              </w:rPr>
+              <w:t>[1] Dark Reading</w:t>
+            </w:r>
+          </w:p>
+        </w:tc>
+      </w:tr>
+      <w:tr>
+        <w:tc>
+          <w:tcPr>
+            <w:tcW w:type="dxa" w:w="2520"/>
+            <w:tcBorders>
+              <w:top w:val="single" w:sz="4" w:space="0" w:color="CCCCCC"/>
+              <w:bottom w:val="single" w:sz="4" w:space="0" w:color="CCCCCC"/>
+              <w:left w:val="single" w:sz="4" w:space="0" w:color="CCCCCC"/>
+              <w:right w:val="single" w:sz="4" w:space="0" w:color="CCCCCC"/>
+            </w:tcBorders>
+          </w:tcPr>
+          <w:p>
+            <w:r>
+              <w:rPr>
+                <w:color w:val="333333"/>
+                <w:sz w:val="18"/>
+              </w:rPr>
+              <w:t>US Law Firms</w:t>
             </w:r>
           </w:p>
         </w:tc>
@@ -1319,7 +1127,7 @@
                 <w:color w:val="333333"/>
                 <w:sz w:val="18"/>
               </w:rPr>
-              <w:t>Glassworm botnet</w:t>
+              <w:t>Developer Supply Chain</w:t>
             </w:r>
           </w:p>
         </w:tc>
@@ -1339,7 +1147,7 @@
                 <w:color w:val="333333"/>
                 <w:sz w:val="18"/>
               </w:rPr>
-              <w:t>Supply Chain Attack</w:t>
+              <w:t>Botnet Disruption</w:t>
             </w:r>
           </w:p>
         </w:tc>
@@ -1384,6 +1192,170 @@
           </w:p>
         </w:tc>
       </w:tr>
+      <w:tr>
+        <w:tc>
+          <w:tcPr>
+            <w:tcW w:type="dxa" w:w="2520"/>
+            <w:tcBorders>
+              <w:top w:val="single" w:sz="4" w:space="0" w:color="CCCCCC"/>
+              <w:bottom w:val="single" w:sz="4" w:space="0" w:color="CCCCCC"/>
+              <w:left w:val="single" w:sz="4" w:space="0" w:color="CCCCCC"/>
+              <w:right w:val="single" w:sz="4" w:space="0" w:color="CCCCCC"/>
+            </w:tcBorders>
+          </w:tcPr>
+          <w:p>
+            <w:r>
+              <w:rPr>
+                <w:color w:val="333333"/>
+                <w:sz w:val="18"/>
+              </w:rPr>
+              <w:t>Claude AI Users</w:t>
+            </w:r>
+          </w:p>
+        </w:tc>
+        <w:tc>
+          <w:tcPr>
+            <w:tcW w:type="dxa" w:w="2520"/>
+            <w:tcBorders>
+              <w:top w:val="single" w:sz="4" w:space="0" w:color="CCCCCC"/>
+              <w:bottom w:val="single" w:sz="4" w:space="0" w:color="CCCCCC"/>
+              <w:left w:val="single" w:sz="4" w:space="0" w:color="CCCCCC"/>
+              <w:right w:val="single" w:sz="4" w:space="0" w:color="CCCCCC"/>
+            </w:tcBorders>
+          </w:tcPr>
+          <w:p>
+            <w:r>
+              <w:rPr>
+                <w:color w:val="333333"/>
+                <w:sz w:val="18"/>
+              </w:rPr>
+              <w:t>Supply Chain/Data Theft</w:t>
+            </w:r>
+          </w:p>
+        </w:tc>
+        <w:tc>
+          <w:tcPr>
+            <w:tcW w:type="dxa" w:w="2520"/>
+            <w:tcBorders>
+              <w:top w:val="single" w:sz="4" w:space="0" w:color="CCCCCC"/>
+              <w:bottom w:val="single" w:sz="4" w:space="0" w:color="CCCCCC"/>
+              <w:left w:val="single" w:sz="4" w:space="0" w:color="CCCCCC"/>
+              <w:right w:val="single" w:sz="4" w:space="0" w:color="CCCCCC"/>
+            </w:tcBorders>
+          </w:tcPr>
+          <w:p>
+            <w:r>
+              <w:rPr>
+                <w:color w:val="333333"/>
+                <w:sz w:val="18"/>
+              </w:rPr>
+              <w:t>2026-05-27</w:t>
+            </w:r>
+          </w:p>
+        </w:tc>
+        <w:tc>
+          <w:tcPr>
+            <w:tcW w:type="dxa" w:w="2520"/>
+            <w:tcBorders>
+              <w:top w:val="single" w:sz="4" w:space="0" w:color="CCCCCC"/>
+              <w:bottom w:val="single" w:sz="4" w:space="0" w:color="CCCCCC"/>
+              <w:left w:val="single" w:sz="4" w:space="0" w:color="CCCCCC"/>
+              <w:right w:val="single" w:sz="4" w:space="0" w:color="CCCCCC"/>
+            </w:tcBorders>
+          </w:tcPr>
+          <w:p>
+            <w:r>
+              <w:rPr>
+                <w:color w:val="333333"/>
+                <w:sz w:val="18"/>
+              </w:rPr>
+              <w:t>[4] The Hacker News</w:t>
+            </w:r>
+          </w:p>
+        </w:tc>
+      </w:tr>
+      <w:tr>
+        <w:tc>
+          <w:tcPr>
+            <w:tcW w:type="dxa" w:w="2520"/>
+            <w:tcBorders>
+              <w:top w:val="single" w:sz="4" w:space="0" w:color="CCCCCC"/>
+              <w:bottom w:val="single" w:sz="4" w:space="0" w:color="CCCCCC"/>
+              <w:left w:val="single" w:sz="4" w:space="0" w:color="CCCCCC"/>
+              <w:right w:val="single" w:sz="4" w:space="0" w:color="CCCCCC"/>
+            </w:tcBorders>
+          </w:tcPr>
+          <w:p>
+            <w:r>
+              <w:rPr>
+                <w:color w:val="333333"/>
+                <w:sz w:val="18"/>
+              </w:rPr>
+              <w:t>High-Performance Computing</w:t>
+            </w:r>
+          </w:p>
+        </w:tc>
+        <w:tc>
+          <w:tcPr>
+            <w:tcW w:type="dxa" w:w="2520"/>
+            <w:tcBorders>
+              <w:top w:val="single" w:sz="4" w:space="0" w:color="CCCCCC"/>
+              <w:bottom w:val="single" w:sz="4" w:space="0" w:color="CCCCCC"/>
+              <w:left w:val="single" w:sz="4" w:space="0" w:color="CCCCCC"/>
+              <w:right w:val="single" w:sz="4" w:space="0" w:color="CCCCCC"/>
+            </w:tcBorders>
+          </w:tcPr>
+          <w:p>
+            <w:r>
+              <w:rPr>
+                <w:color w:val="333333"/>
+                <w:sz w:val="18"/>
+              </w:rPr>
+              <w:t>Cryptojacking</w:t>
+            </w:r>
+          </w:p>
+        </w:tc>
+        <w:tc>
+          <w:tcPr>
+            <w:tcW w:type="dxa" w:w="2520"/>
+            <w:tcBorders>
+              <w:top w:val="single" w:sz="4" w:space="0" w:color="CCCCCC"/>
+              <w:bottom w:val="single" w:sz="4" w:space="0" w:color="CCCCCC"/>
+              <w:left w:val="single" w:sz="4" w:space="0" w:color="CCCCCC"/>
+              <w:right w:val="single" w:sz="4" w:space="0" w:color="CCCCCC"/>
+            </w:tcBorders>
+          </w:tcPr>
+          <w:p>
+            <w:r>
+              <w:rPr>
+                <w:color w:val="333333"/>
+                <w:sz w:val="18"/>
+              </w:rPr>
+              <w:t>2026-05-27</w:t>
+            </w:r>
+          </w:p>
+        </w:tc>
+        <w:tc>
+          <w:tcPr>
+            <w:tcW w:type="dxa" w:w="2520"/>
+            <w:tcBorders>
+              <w:top w:val="single" w:sz="4" w:space="0" w:color="CCCCCC"/>
+              <w:bottom w:val="single" w:sz="4" w:space="0" w:color="CCCCCC"/>
+              <w:left w:val="single" w:sz="4" w:space="0" w:color="CCCCCC"/>
+              <w:right w:val="single" w:sz="4" w:space="0" w:color="CCCCCC"/>
+            </w:tcBorders>
+          </w:tcPr>
+          <w:p>
+            <w:r>
+              <w:rPr>
+                <w:color w:val="333333"/>
+                <w:sz w:val="18"/>
+              </w:rPr>
+              <w:t>[5] BleepingComputer</w:t>
+            </w:r>
+          </w:p>
+        </w:tc>
+      </w:tr>
     </w:tbl>
     <w:p>
       <w:pPr>
@@ -1396,7 +1368,7 @@
           <w:color w:val="666666"/>
           <w:sz w:val="14"/>
         </w:rPr>
-        <w:t>Table: 2 peer incidents from OSINT sources. Incidents may indicate threat actor targeting patterns or emerging attack vectors.</w:t>
+        <w:t>Table: 5 peer incidents from OSINT sources. Incidents may indicate threat actor targeting patterns or emerging attack vectors.</w:t>
       </w:r>
     </w:p>
     <w:p/>
@@ -1422,7 +1394,7 @@
           <w:b/>
           <w:sz w:val="20"/>
         </w:rPr>
-        <w:t>Patch all systems affected by critical CVEs in NVIDIA Triton Inference Server, NLnet Labs Unbound, and WordPress plugins immediately.</w:t>
+        <w:t>Patch all critical vulnerabilities in laboratory and healthcare systems, prioritizing NVIDIA Triton Inference Server and Mesalvo Meona components.</w:t>
       </w:r>
     </w:p>
     <w:p>
@@ -1433,7 +1405,7 @@
         <w:rPr>
           <w:sz w:val="20"/>
         </w:rPr>
-        <w:t>Monitor for signs of ransomware and extortion activity, especially targeting healthcare and manufacturing endpoints.</w:t>
+        <w:t>Monitor for ransomware and extortion activity, including in-person data theft attempts and underground sales of organizational data.</w:t>
       </w:r>
     </w:p>
     <w:p>
@@ -1444,7 +1416,7 @@
         <w:rPr>
           <w:sz w:val="20"/>
         </w:rPr>
-        <w:t>Review supply chain and vendor communications for signs of compromise, including DNS poisoning and developer tool attacks.</w:t>
+        <w:t>Enhance supply chain security by validating developer tools and monitoring for malicious packages or botnet activity.</w:t>
       </w:r>
     </w:p>
     <w:p>
@@ -1455,7 +1427,7 @@
         <w:rPr>
           <w:sz w:val="20"/>
         </w:rPr>
-        <w:t>Enable multi-factor authentication and strengthen access controls for all administrative and privileged accounts.</w:t>
+        <w:t>Deploy advanced endpoint protection and network monitoring to detect cryptojacking and privilege escalation attempts.</w:t>
       </w:r>
     </w:p>
     <w:p>
@@ -1466,7 +1438,7 @@
         <w:rPr>
           <w:sz w:val="20"/>
         </w:rPr>
-        <w:t>Deploy enhanced monitoring for AI workloads and laboratory equipment, including anomaly detection and network segmentation.</w:t>
+        <w:t>Review access controls and privilege assignments in web portals and communication platforms to prevent unauthorized account takeover.</w:t>
       </w:r>
     </w:p>
     <w:p/>
@@ -1528,7 +1500,7 @@
         <w:rPr>
           <w:sz w:val="20"/>
         </w:rPr>
-        <w:t>CISA Known Exploited Vulnerabilities (KEV) Catalog</w:t>
+        <w:t>Intel471 Titan threat intelligence platform</w:t>
       </w:r>
     </w:p>
     <w:p>
@@ -1542,25 +1514,6 @@
           <w:sz w:val="20"/>
         </w:rPr>
         <w:t xml:space="preserve">[3] </w:t>
-      </w:r>
-      <w:r>
-        <w:rPr>
-          <w:sz w:val="20"/>
-        </w:rPr>
-        <w:t>Intel471 Titan threat intelligence platform</w:t>
-      </w:r>
-    </w:p>
-    <w:p>
-      <w:pPr>
-        <w:pStyle w:val="ListBullet"/>
-      </w:pPr>
-      <w:r>
-        <w:rPr>
-          <w:b/>
-          <w:color w:val="333333"/>
-          <w:sz w:val="20"/>
-        </w:rPr>
-        <w:t xml:space="preserve">[4] </w:t>
       </w:r>
       <w:r>
         <w:rPr>
@@ -1590,7 +1543,7 @@
           <w:color w:val="333333"/>
           <w:sz w:val="16"/>
         </w:rPr>
-        <w:t xml:space="preserve">[1] </w:t>
+        <w:t xml:space="preserve">[4] </w:t>
       </w:r>
       <w:hyperlink r:id="rId10">
         <w:r>
@@ -1598,7 +1551,7 @@
             <w:color w:val="0563C1"/>
             <w:u w:val="single"/>
           </w:rPr>
-          <w:t>AI-Assisted Exploit Development</w:t>
+          <w:t>Latin America Data Leak</w:t>
         </w:r>
       </w:hyperlink>
       <w:r>
@@ -1607,7 +1560,7 @@
           <w:color w:val="666666"/>
           <w:sz w:val="16"/>
         </w:rPr>
-        <w:t xml:space="preserve"> - Highlights acceleration of exploit development using AI, increasing risk from new CVEs.</w:t>
+        <w:t xml:space="preserve"> - Peer incident showing large-scale government data leak relevant to supply chain and regulatory risk.</w:t>
       </w:r>
     </w:p>
     <w:p>
@@ -1620,7 +1573,7 @@
           <w:color w:val="333333"/>
           <w:sz w:val="16"/>
         </w:rPr>
-        <w:t xml:space="preserve">[2] </w:t>
+        <w:t xml:space="preserve">[5] </w:t>
       </w:r>
       <w:hyperlink r:id="rId11">
         <w:r>
@@ -1628,7 +1581,7 @@
             <w:color w:val="0563C1"/>
             <w:u w:val="single"/>
           </w:rPr>
-          <w:t>FBI warns of in-person data theft attacks</w:t>
+          <w:t>FBI Law Firm Warning</w:t>
         </w:r>
       </w:hyperlink>
       <w:r>
@@ -1637,7 +1590,7 @@
           <w:color w:val="666666"/>
           <w:sz w:val="16"/>
         </w:rPr>
-        <w:t xml:space="preserve"> - Documents ransomware group targeting law firms and healthcare with in-person data theft.</w:t>
+        <w:t xml:space="preserve"> - Highlights active ransomware and extortion targeting healthcare and law firms.</w:t>
       </w:r>
     </w:p>
     <w:p>
@@ -1650,7 +1603,7 @@
           <w:color w:val="333333"/>
           <w:sz w:val="16"/>
         </w:rPr>
-        <w:t xml:space="preserve">[3] </w:t>
+        <w:t xml:space="preserve">[6] </w:t>
       </w:r>
       <w:hyperlink r:id="rId12">
         <w:r>
@@ -1658,7 +1611,7 @@
             <w:color w:val="0563C1"/>
             <w:u w:val="single"/>
           </w:rPr>
-          <w:t>Glassworm botnet disrupted</w:t>
+          <w:t>Glassworm Botnet Disruption</w:t>
         </w:r>
       </w:hyperlink>
       <w:r>
@@ -1667,7 +1620,7 @@
           <w:color w:val="666666"/>
           <w:sz w:val="16"/>
         </w:rPr>
-        <w:t xml:space="preserve"> - Details supply chain attack infrastructure targeting developers and research organizations.</w:t>
+        <w:t xml:space="preserve"> - Supply chain attack context for developer tools and botnet infrastructure.</w:t>
       </w:r>
     </w:p>
     <w:p>
@@ -1680,7 +1633,7 @@
           <w:color w:val="333333"/>
           <w:sz w:val="16"/>
         </w:rPr>
-        <w:t xml:space="preserve">[4] </w:t>
+        <w:t xml:space="preserve">[7] </w:t>
       </w:r>
       <w:hyperlink r:id="rId13">
         <w:r>
@@ -1688,7 +1641,7 @@
             <w:color w:val="0563C1"/>
             <w:u w:val="single"/>
           </w:rPr>
-          <w:t>CISA Adds Three Known Exploited Vulnerabilities</w:t>
+          <w:t>Malicious npm Package</w:t>
         </w:r>
       </w:hyperlink>
       <w:r>
@@ -1697,7 +1650,37 @@
           <w:color w:val="666666"/>
           <w:sz w:val="16"/>
         </w:rPr>
-        <w:t xml:space="preserve"> - Confirms addition of actively exploited CVEs to KEV catalog.</w:t>
+        <w:t xml:space="preserve"> - Supply chain compromise affecting AI and developer platforms.</w:t>
+      </w:r>
+    </w:p>
+    <w:p>
+      <w:pPr>
+        <w:pStyle w:val="ListBullet"/>
+      </w:pPr>
+      <w:r>
+        <w:rPr>
+          <w:b/>
+          <w:color w:val="333333"/>
+          <w:sz w:val="16"/>
+        </w:rPr>
+        <w:t xml:space="preserve">[8] </w:t>
+      </w:r>
+      <w:hyperlink r:id="rId14">
+        <w:r>
+          <w:rPr>
+            <w:color w:val="0563C1"/>
+            <w:u w:val="single"/>
+          </w:rPr>
+          <w:t>GPU Mining Malware</w:t>
+        </w:r>
+      </w:hyperlink>
+      <w:r>
+        <w:rPr>
+          <w:i/>
+          <w:color w:val="666666"/>
+          <w:sz w:val="16"/>
+        </w:rPr>
+        <w:t xml:space="preserve"> - Emerging cryptojacking campaign targeting high-performance computing relevant to genomics research.</w:t>
       </w:r>
     </w:p>
     <w:p/>

</xml_diff>